<commit_message>
Completed all tutorials and notes
</commit_message>
<xml_diff>
--- a/Java_language_tutorial/Java_tutorial_notes.docx
+++ b/Java_language_tutorial/Java_tutorial_notes.docx
@@ -46,6 +46,46 @@
       <w:pPr>
         <w:pStyle w:val="NoSpacing"/>
       </w:pPr>
+      <w:r>
+        <w:t>Or</w:t>
+      </w:r>
+    </w:p>
+    <w:p>
+      <w:pPr>
+        <w:pStyle w:val="NoSpacing"/>
+        <w:rPr>
+          <w:b/>
+          <w:bCs/>
+        </w:rPr>
+      </w:pPr>
+      <w:r>
+        <w:rPr>
+          <w:b/>
+          <w:bCs/>
+        </w:rPr>
+        <w:t>Public class User {</w:t>
+      </w:r>
+    </w:p>
+    <w:p>
+      <w:pPr>
+        <w:pStyle w:val="NoSpacing"/>
+        <w:rPr>
+          <w:b/>
+          <w:bCs/>
+        </w:rPr>
+      </w:pPr>
+      <w:r>
+        <w:rPr>
+          <w:b/>
+          <w:bCs/>
+        </w:rPr>
+        <w:t>}</w:t>
+      </w:r>
+    </w:p>
+    <w:p>
+      <w:pPr>
+        <w:pStyle w:val="NoSpacing"/>
+      </w:pPr>
     </w:p>
     <w:p>
       <w:pPr>
@@ -529,6 +569,7 @@
         <w:rPr>
           <w:u w:val="single"/>
         </w:rPr>
+        <w:lastRenderedPageBreak/>
         <w:t>characters</w:t>
       </w:r>
       <w:r>
@@ -558,7 +599,6 @@
         <w:rPr>
           <w:u w:val="single"/>
         </w:rPr>
-        <w:lastRenderedPageBreak/>
         <w:t>Strings</w:t>
       </w:r>
     </w:p>
@@ -617,6 +657,87 @@
       <w:r>
         <w:br/>
       </w:r>
+    </w:p>
+    <w:p>
+      <w:pPr>
+        <w:pStyle w:val="NoSpacing"/>
+        <w:rPr>
+          <w:u w:val="single"/>
+        </w:rPr>
+      </w:pPr>
+      <w:r>
+        <w:rPr>
+          <w:u w:val="single"/>
+        </w:rPr>
+        <w:t>Dates</w:t>
+      </w:r>
+    </w:p>
+    <w:p>
+      <w:pPr>
+        <w:pStyle w:val="NoSpacing"/>
+      </w:pPr>
+      <w:r>
+        <w:t xml:space="preserve">First, you must import the </w:t>
+      </w:r>
+      <w:proofErr w:type="spellStart"/>
+      <w:r>
+        <w:t>LocalDate</w:t>
+      </w:r>
+      <w:proofErr w:type="spellEnd"/>
+      <w:r>
+        <w:t xml:space="preserve"> class like, </w:t>
+      </w:r>
+      <w:r>
+        <w:rPr>
+          <w:b/>
+          <w:bCs/>
+        </w:rPr>
+        <w:t xml:space="preserve">import </w:t>
+      </w:r>
+      <w:proofErr w:type="spellStart"/>
+      <w:r>
+        <w:rPr>
+          <w:b/>
+          <w:bCs/>
+        </w:rPr>
+        <w:t>java.time.LocalDate</w:t>
+      </w:r>
+      <w:proofErr w:type="spellEnd"/>
+      <w:r>
+        <w:t xml:space="preserve">. Then you can declare a </w:t>
+      </w:r>
+      <w:proofErr w:type="spellStart"/>
+      <w:r>
+        <w:t>LocalDate</w:t>
+      </w:r>
+      <w:proofErr w:type="spellEnd"/>
+      <w:r>
+        <w:t xml:space="preserve"> by writing e.g. “</w:t>
+      </w:r>
+      <w:proofErr w:type="spellStart"/>
+      <w:r>
+        <w:rPr>
+          <w:b/>
+          <w:bCs/>
+        </w:rPr>
+        <w:t>LocalDate</w:t>
+      </w:r>
+      <w:proofErr w:type="spellEnd"/>
+      <w:r>
+        <w:rPr>
+          <w:b/>
+          <w:bCs/>
+        </w:rPr>
+        <w:t xml:space="preserve"> birthday</w:t>
+      </w:r>
+      <w:r>
+        <w:t>;”</w:t>
+      </w:r>
+    </w:p>
+    <w:p>
+      <w:pPr>
+        <w:pStyle w:val="NoSpacing"/>
+      </w:pPr>
     </w:p>
     <w:p>
       <w:pPr>
@@ -1401,6 +1522,7 @@
         <w:rPr>
           <w:u w:val="single"/>
         </w:rPr>
+        <w:lastRenderedPageBreak/>
         <w:t>Replace a part of a string (does not change the original string)</w:t>
       </w:r>
       <w:r>
@@ -2313,6 +2435,7 @@
         <w:br/>
       </w:r>
       <w:r>
+        <w:lastRenderedPageBreak/>
         <w:br/>
         <w:t>can use a not operator to change boolean value (only works for one variable at a time)</w:t>
       </w:r>
@@ -2404,7 +2527,6 @@
         <w:pStyle w:val="NoSpacing"/>
       </w:pPr>
       <w:r>
-        <w:lastRenderedPageBreak/>
         <w:t xml:space="preserve">To </w:t>
       </w:r>
       <w:r>
@@ -3316,6 +3438,7 @@
         <w:pStyle w:val="NoSpacing"/>
       </w:pPr>
       <w:r>
+        <w:lastRenderedPageBreak/>
         <w:t>To do an if (/ if else / else) statement you write it like:</w:t>
       </w:r>
     </w:p>
@@ -3428,21 +3551,7 @@
           <w:b/>
           <w:bCs/>
         </w:rPr>
-        <w:t>(“</w:t>
-      </w:r>
-      <w:r>
-        <w:rPr>
-          <w:b/>
-          <w:bCs/>
-        </w:rPr>
-        <w:t>-</w:t>
-      </w:r>
-      <w:r>
-        <w:rPr>
-          <w:b/>
-          <w:bCs/>
-        </w:rPr>
-        <w:t>”)){</w:t>
+        <w:t>(“-”)){</w:t>
       </w:r>
     </w:p>
     <w:p>
@@ -3468,21 +3577,7 @@
           <w:b/>
           <w:bCs/>
         </w:rPr>
-        <w:t xml:space="preserve">(“You wanted to </w:t>
-      </w:r>
-      <w:r>
-        <w:rPr>
-          <w:b/>
-          <w:bCs/>
-        </w:rPr>
-        <w:t>subtract one thing from the other</w:t>
-      </w:r>
-      <w:r>
-        <w:rPr>
-          <w:b/>
-          <w:bCs/>
-        </w:rPr>
-        <w:t>”);</w:t>
+        <w:t>(“You wanted to subtract one thing from the other”);</w:t>
       </w:r>
     </w:p>
     <w:p>
@@ -3514,7 +3609,6 @@
           <w:b/>
           <w:bCs/>
         </w:rPr>
-        <w:lastRenderedPageBreak/>
         <w:t>else {</w:t>
       </w:r>
     </w:p>
@@ -4069,6 +4163,7 @@
           <w:b/>
           <w:bCs/>
         </w:rPr>
+        <w:lastRenderedPageBreak/>
         <w:t>vowels[0] = 'a';</w:t>
       </w:r>
       <w:r>
@@ -4151,7 +4246,6 @@
           <w:b/>
           <w:bCs/>
         </w:rPr>
-        <w:lastRenderedPageBreak/>
         <w:t>char vowels</w:t>
       </w:r>
       <w:r>
@@ -4237,21 +4331,7 @@
           <w:b/>
           <w:bCs/>
         </w:rPr>
-        <w:t>System</w:t>
-      </w:r>
-      <w:r>
-        <w:rPr>
-          <w:b/>
-          <w:bCs/>
-        </w:rPr>
-        <w:t>.out</w:t>
-      </w:r>
-      <w:r>
-        <w:rPr>
-          <w:b/>
-          <w:bCs/>
-        </w:rPr>
-        <w:t>.println</w:t>
+        <w:t>System.out.println</w:t>
       </w:r>
       <w:proofErr w:type="spellEnd"/>
       <w:r>
@@ -4318,21 +4398,7 @@
           <w:b/>
           <w:bCs/>
         </w:rPr>
-        <w:t>System</w:t>
-      </w:r>
-      <w:r>
-        <w:rPr>
-          <w:b/>
-          <w:bCs/>
-        </w:rPr>
-        <w:t>.out</w:t>
-      </w:r>
-      <w:r>
-        <w:rPr>
-          <w:b/>
-          <w:bCs/>
-        </w:rPr>
-        <w:t>.println</w:t>
+        <w:t>System.out.println</w:t>
       </w:r>
       <w:proofErr w:type="spellEnd"/>
       <w:r>
@@ -4514,10 +4580,7 @@
         <w:ind w:left="720" w:hanging="720"/>
       </w:pPr>
       <w:r>
-        <w:t xml:space="preserve">To sort the array in a specified range, you can use </w:t>
-      </w:r>
-      <w:r>
-        <w:t>‘</w:t>
+        <w:t>To sort the array in a specified range, you can use ‘</w:t>
       </w:r>
       <w:proofErr w:type="spellStart"/>
       <w:r>
@@ -4542,13 +4605,7 @@
         <w:ind w:left="720" w:hanging="720"/>
       </w:pPr>
       <w:r>
-        <w:t>end index</w:t>
-      </w:r>
-      <w:r>
-        <w:t>)’</w:t>
-      </w:r>
-      <w:r>
-        <w:t xml:space="preserve"> </w:t>
+        <w:t xml:space="preserve">end index)’ </w:t>
       </w:r>
       <w:r>
         <w:sym w:font="Wingdings" w:char="F0E0"/>
@@ -4702,14 +4759,7 @@
           <w:b/>
           <w:bCs/>
         </w:rPr>
-        <w:t>(vowels2, key);</w:t>
-      </w:r>
-      <w:r>
-        <w:rPr>
-          <w:b/>
-          <w:bCs/>
-        </w:rPr>
-        <w:t xml:space="preserve"> </w:t>
+        <w:t xml:space="preserve">(vowels2, key); </w:t>
       </w:r>
       <w:r>
         <w:rPr>
@@ -5131,6 +5181,7 @@
         <w:pStyle w:val="NoSpacing"/>
       </w:pPr>
       <w:r>
+        <w:lastRenderedPageBreak/>
         <w:t xml:space="preserve">Then the </w:t>
       </w:r>
       <w:proofErr w:type="spellStart"/>
@@ -5266,7 +5317,6 @@
         <w:pStyle w:val="NoSpacing"/>
       </w:pPr>
       <w:r>
-        <w:lastRenderedPageBreak/>
         <w:t xml:space="preserve">The length can be </w:t>
       </w:r>
       <w:r>
@@ -5486,14 +5536,7 @@
           <w:b/>
           <w:bCs/>
         </w:rPr>
-        <w:t>++){</w:t>
-      </w:r>
-      <w:r>
-        <w:rPr>
-          <w:b/>
-          <w:bCs/>
-        </w:rPr>
-        <w:t xml:space="preserve"> </w:t>
+        <w:t xml:space="preserve">++){ </w:t>
       </w:r>
       <w:r>
         <w:rPr>
@@ -5610,14 +5653,7 @@
           <w:b/>
           <w:bCs/>
         </w:rPr>
-        <w:t xml:space="preserve">for (int number : numbers){ </w:t>
-      </w:r>
-      <w:r>
-        <w:rPr>
-          <w:b/>
-          <w:bCs/>
-        </w:rPr>
-        <w:t xml:space="preserve"> </w:t>
+        <w:t xml:space="preserve">for (int number : numbers){  </w:t>
       </w:r>
       <w:r>
         <w:rPr>
@@ -6138,6 +6174,7 @@
         <w:pStyle w:val="NoSpacing"/>
       </w:pPr>
       <w:r>
+        <w:lastRenderedPageBreak/>
         <w:t>“Integer” is the reference type for int, “Double” is for double, “Float” is for float etc…</w:t>
       </w:r>
     </w:p>
@@ -6300,7 +6337,6 @@
         <w:pStyle w:val="NoSpacing"/>
       </w:pPr>
       <w:r>
-        <w:lastRenderedPageBreak/>
         <w:t xml:space="preserve">To </w:t>
       </w:r>
       <w:r>
@@ -7032,14 +7068,7 @@
           <w:b/>
           <w:bCs/>
         </w:rPr>
-        <w:t>n</w:t>
-      </w:r>
-      <w:r>
-        <w:rPr>
-          <w:b/>
-          <w:bCs/>
-        </w:rPr>
-        <w:t>umbersArrayList.contains</w:t>
+        <w:t>numbersArrayList.contains</w:t>
       </w:r>
       <w:proofErr w:type="spellEnd"/>
       <w:r>
@@ -7072,14 +7101,7 @@
           <w:b/>
           <w:bCs/>
         </w:rPr>
-        <w:t>(1)</w:t>
-      </w:r>
-      <w:r>
-        <w:rPr>
-          <w:b/>
-          <w:bCs/>
-        </w:rPr>
-        <w:t>);</w:t>
+        <w:t>(1));</w:t>
       </w:r>
       <w:r>
         <w:rPr>
@@ -7269,6 +7291,7 @@
           <w:b/>
           <w:bCs/>
         </w:rPr>
+        <w:lastRenderedPageBreak/>
         <w:t>numbersArrayList.forEach</w:t>
       </w:r>
       <w:proofErr w:type="spellEnd"/>
@@ -7317,14 +7340,7 @@
           <w:b/>
           <w:bCs/>
         </w:rPr>
-        <w:t>(number), number * 2);</w:t>
-      </w:r>
-      <w:r>
-        <w:rPr>
-          <w:b/>
-          <w:bCs/>
-        </w:rPr>
-        <w:t xml:space="preserve"> </w:t>
+        <w:t xml:space="preserve">(number), number * 2); </w:t>
       </w:r>
       <w:r>
         <w:sym w:font="Wingdings" w:char="F0E0"/>
@@ -7422,7 +7438,6 @@
           <w:b/>
           <w:bCs/>
         </w:rPr>
-        <w:lastRenderedPageBreak/>
         <w:t xml:space="preserve">for (int number : </w:t>
       </w:r>
       <w:proofErr w:type="spellStart"/>
@@ -7489,6 +7504,1881 @@
         <w:br/>
         <w:t>}</w:t>
       </w:r>
+    </w:p>
+    <w:p>
+      <w:pPr>
+        <w:pStyle w:val="NoSpacing"/>
+      </w:pPr>
+    </w:p>
+    <w:p>
+      <w:pPr>
+        <w:pStyle w:val="NoSpacing"/>
+        <w:rPr>
+          <w:b/>
+          <w:bCs/>
+          <w:u w:val="single"/>
+        </w:rPr>
+      </w:pPr>
+      <w:proofErr w:type="spellStart"/>
+      <w:r>
+        <w:rPr>
+          <w:b/>
+          <w:bCs/>
+          <w:u w:val="single"/>
+        </w:rPr>
+        <w:t>HashMaps</w:t>
+      </w:r>
+      <w:proofErr w:type="spellEnd"/>
+    </w:p>
+    <w:p>
+      <w:pPr>
+        <w:pStyle w:val="NoSpacing"/>
+      </w:pPr>
+      <w:proofErr w:type="spellStart"/>
+      <w:r>
+        <w:t>HashMaps</w:t>
+      </w:r>
+      <w:proofErr w:type="spellEnd"/>
+      <w:r>
+        <w:t xml:space="preserve"> are key value pairs (similar to dictionaries in python).</w:t>
+      </w:r>
+    </w:p>
+    <w:p>
+      <w:pPr>
+        <w:pStyle w:val="NoSpacing"/>
+      </w:pPr>
+      <w:r>
+        <w:t xml:space="preserve">To declare a </w:t>
+      </w:r>
+      <w:proofErr w:type="spellStart"/>
+      <w:r>
+        <w:t>hashMap</w:t>
+      </w:r>
+      <w:proofErr w:type="spellEnd"/>
+      <w:r>
+        <w:t>, you first need to import the HashMap class e.g.:</w:t>
+      </w:r>
+    </w:p>
+    <w:p>
+      <w:pPr>
+        <w:pStyle w:val="NoSpacing"/>
+        <w:rPr>
+          <w:b/>
+          <w:bCs/>
+        </w:rPr>
+      </w:pPr>
+      <w:r>
+        <w:rPr>
+          <w:b/>
+          <w:bCs/>
+        </w:rPr>
+        <w:t xml:space="preserve">import </w:t>
+      </w:r>
+      <w:proofErr w:type="spellStart"/>
+      <w:r>
+        <w:rPr>
+          <w:b/>
+          <w:bCs/>
+        </w:rPr>
+        <w:t>java.util.HashMap</w:t>
+      </w:r>
+      <w:proofErr w:type="spellEnd"/>
+      <w:r>
+        <w:rPr>
+          <w:b/>
+          <w:bCs/>
+        </w:rPr>
+        <w:t>;</w:t>
+      </w:r>
+    </w:p>
+    <w:p>
+      <w:pPr>
+        <w:pStyle w:val="NoSpacing"/>
+      </w:pPr>
+      <w:r>
+        <w:t>Then you write “</w:t>
+      </w:r>
+      <w:r>
+        <w:rPr>
+          <w:b/>
+          <w:bCs/>
+        </w:rPr>
+        <w:t>HashMap&lt;</w:t>
+      </w:r>
+      <w:proofErr w:type="spellStart"/>
+      <w:r>
+        <w:rPr>
+          <w:b/>
+          <w:bCs/>
+        </w:rPr>
+        <w:t>FirtstDataType</w:t>
+      </w:r>
+      <w:proofErr w:type="spellEnd"/>
+      <w:r>
+        <w:rPr>
+          <w:b/>
+          <w:bCs/>
+        </w:rPr>
+        <w:t xml:space="preserve"> (For the key)</w:t>
+      </w:r>
+      <w:r>
+        <w:rPr>
+          <w:b/>
+          <w:bCs/>
+        </w:rPr>
+        <w:t xml:space="preserve">, </w:t>
+      </w:r>
+      <w:proofErr w:type="spellStart"/>
+      <w:r>
+        <w:rPr>
+          <w:b/>
+          <w:bCs/>
+        </w:rPr>
+        <w:t>secondDataType</w:t>
+      </w:r>
+      <w:proofErr w:type="spellEnd"/>
+      <w:r>
+        <w:rPr>
+          <w:b/>
+          <w:bCs/>
+        </w:rPr>
+        <w:t xml:space="preserve">&gt; </w:t>
+      </w:r>
+      <w:proofErr w:type="spellStart"/>
+      <w:r>
+        <w:rPr>
+          <w:b/>
+          <w:bCs/>
+        </w:rPr>
+        <w:t>hashMapName</w:t>
+      </w:r>
+      <w:proofErr w:type="spellEnd"/>
+      <w:r>
+        <w:rPr>
+          <w:b/>
+          <w:bCs/>
+        </w:rPr>
+        <w:t xml:space="preserve"> = new HashMap&lt; </w:t>
+      </w:r>
+      <w:proofErr w:type="spellStart"/>
+      <w:r>
+        <w:rPr>
+          <w:b/>
+          <w:bCs/>
+        </w:rPr>
+        <w:t>FirtstDataType</w:t>
+      </w:r>
+      <w:proofErr w:type="spellEnd"/>
+      <w:r>
+        <w:rPr>
+          <w:b/>
+          <w:bCs/>
+        </w:rPr>
+        <w:t xml:space="preserve">, </w:t>
+      </w:r>
+      <w:proofErr w:type="spellStart"/>
+      <w:r>
+        <w:rPr>
+          <w:b/>
+          <w:bCs/>
+        </w:rPr>
+        <w:t>secondDataType</w:t>
+      </w:r>
+      <w:proofErr w:type="spellEnd"/>
+      <w:r>
+        <w:rPr>
+          <w:b/>
+          <w:bCs/>
+        </w:rPr>
+        <w:t>&gt;()”</w:t>
+      </w:r>
+      <w:r>
+        <w:t>, e.g.:</w:t>
+      </w:r>
+    </w:p>
+    <w:p>
+      <w:pPr>
+        <w:pStyle w:val="NoSpacing"/>
+        <w:rPr>
+          <w:b/>
+          <w:bCs/>
+        </w:rPr>
+      </w:pPr>
+      <w:r>
+        <w:rPr>
+          <w:b/>
+          <w:bCs/>
+        </w:rPr>
+        <w:t xml:space="preserve">HashMap&lt;String, Integer&gt; </w:t>
+      </w:r>
+      <w:proofErr w:type="spellStart"/>
+      <w:r>
+        <w:rPr>
+          <w:b/>
+          <w:bCs/>
+        </w:rPr>
+        <w:t>examScores</w:t>
+      </w:r>
+      <w:proofErr w:type="spellEnd"/>
+      <w:r>
+        <w:rPr>
+          <w:b/>
+          <w:bCs/>
+        </w:rPr>
+        <w:t xml:space="preserve"> = new HashMap&lt;String, Integer&gt;();</w:t>
+      </w:r>
+    </w:p>
+    <w:p>
+      <w:pPr>
+        <w:pStyle w:val="NoSpacing"/>
+      </w:pPr>
+    </w:p>
+    <w:p>
+      <w:pPr>
+        <w:pStyle w:val="NoSpacing"/>
+      </w:pPr>
+      <w:r>
+        <w:t>To put something inside the HashMap, you can use “</w:t>
+      </w:r>
+      <w:proofErr w:type="spellStart"/>
+      <w:r>
+        <w:rPr>
+          <w:b/>
+          <w:bCs/>
+        </w:rPr>
+        <w:t>HashMapName.put</w:t>
+      </w:r>
+      <w:proofErr w:type="spellEnd"/>
+      <w:r>
+        <w:rPr>
+          <w:b/>
+          <w:bCs/>
+        </w:rPr>
+        <w:t>(value1</w:t>
+      </w:r>
+      <w:r>
+        <w:rPr>
+          <w:b/>
+          <w:bCs/>
+        </w:rPr>
+        <w:t xml:space="preserve"> (The </w:t>
+      </w:r>
+      <w:r>
+        <w:rPr>
+          <w:b/>
+          <w:bCs/>
+        </w:rPr>
+        <w:t>Key</w:t>
+      </w:r>
+      <w:r>
+        <w:rPr>
+          <w:b/>
+          <w:bCs/>
+        </w:rPr>
+        <w:t>)</w:t>
+      </w:r>
+      <w:r>
+        <w:rPr>
+          <w:b/>
+          <w:bCs/>
+        </w:rPr>
+        <w:t>, value2)</w:t>
+      </w:r>
+      <w:r>
+        <w:t xml:space="preserve">” e.g.: </w:t>
+      </w:r>
+      <w:proofErr w:type="spellStart"/>
+      <w:r>
+        <w:rPr>
+          <w:b/>
+          <w:bCs/>
+        </w:rPr>
+        <w:t>examScores.put</w:t>
+      </w:r>
+      <w:proofErr w:type="spellEnd"/>
+      <w:r>
+        <w:rPr>
+          <w:b/>
+          <w:bCs/>
+        </w:rPr>
+        <w:t>("Maths", 90);</w:t>
+      </w:r>
+    </w:p>
+    <w:p>
+      <w:pPr>
+        <w:pStyle w:val="NoSpacing"/>
+      </w:pPr>
+      <w:r>
+        <w:t xml:space="preserve">To put something inside the HashMap if the specified key does not already exist inside the </w:t>
+      </w:r>
+      <w:proofErr w:type="spellStart"/>
+      <w:r>
+        <w:t>hashMap</w:t>
+      </w:r>
+      <w:proofErr w:type="spellEnd"/>
+      <w:r>
+        <w:t>, you use “</w:t>
+      </w:r>
+      <w:proofErr w:type="spellStart"/>
+      <w:r>
+        <w:rPr>
+          <w:b/>
+          <w:bCs/>
+        </w:rPr>
+        <w:t>HashMapName.putIfAbsent</w:t>
+      </w:r>
+      <w:proofErr w:type="spellEnd"/>
+      <w:r>
+        <w:rPr>
+          <w:b/>
+          <w:bCs/>
+        </w:rPr>
+        <w:t>(key, value)</w:t>
+      </w:r>
+      <w:r>
+        <w:t>”</w:t>
+      </w:r>
+    </w:p>
+    <w:p>
+      <w:pPr>
+        <w:pStyle w:val="NoSpacing"/>
+      </w:pPr>
+    </w:p>
+    <w:p>
+      <w:pPr>
+        <w:pStyle w:val="NoSpacing"/>
+        <w:rPr>
+          <w:b/>
+          <w:bCs/>
+        </w:rPr>
+      </w:pPr>
+      <w:r>
+        <w:t xml:space="preserve">To replace the value of a specified key inside the </w:t>
+      </w:r>
+      <w:proofErr w:type="spellStart"/>
+      <w:r>
+        <w:t>hashMap</w:t>
+      </w:r>
+      <w:proofErr w:type="spellEnd"/>
+      <w:r>
+        <w:t>, you use “</w:t>
+      </w:r>
+      <w:proofErr w:type="spellStart"/>
+      <w:r>
+        <w:rPr>
+          <w:b/>
+          <w:bCs/>
+        </w:rPr>
+        <w:t>HashMapName.replace</w:t>
+      </w:r>
+      <w:proofErr w:type="spellEnd"/>
+      <w:r>
+        <w:rPr>
+          <w:b/>
+          <w:bCs/>
+        </w:rPr>
+        <w:t>(Key, value)</w:t>
+      </w:r>
+      <w:r>
+        <w:t xml:space="preserve">” e.g.: </w:t>
+      </w:r>
+      <w:proofErr w:type="spellStart"/>
+      <w:r>
+        <w:rPr>
+          <w:b/>
+          <w:bCs/>
+        </w:rPr>
+        <w:t>examScores.replace</w:t>
+      </w:r>
+      <w:proofErr w:type="spellEnd"/>
+      <w:r>
+        <w:rPr>
+          <w:b/>
+          <w:bCs/>
+        </w:rPr>
+        <w:t>("Maths", 20);</w:t>
+      </w:r>
+    </w:p>
+    <w:p>
+      <w:pPr>
+        <w:pStyle w:val="NoSpacing"/>
+        <w:rPr>
+          <w:b/>
+          <w:bCs/>
+        </w:rPr>
+      </w:pPr>
+    </w:p>
+    <w:p>
+      <w:pPr>
+        <w:pStyle w:val="NoSpacing"/>
+      </w:pPr>
+      <w:r>
+        <w:t xml:space="preserve">To clear the whole </w:t>
+      </w:r>
+      <w:proofErr w:type="spellStart"/>
+      <w:r>
+        <w:t>hashMap</w:t>
+      </w:r>
+      <w:proofErr w:type="spellEnd"/>
+      <w:r>
+        <w:t>, you use “</w:t>
+      </w:r>
+      <w:proofErr w:type="spellStart"/>
+      <w:r>
+        <w:rPr>
+          <w:b/>
+          <w:bCs/>
+        </w:rPr>
+        <w:t>HashMapName.clear</w:t>
+      </w:r>
+      <w:proofErr w:type="spellEnd"/>
+      <w:r>
+        <w:rPr>
+          <w:b/>
+          <w:bCs/>
+        </w:rPr>
+        <w:t>()</w:t>
+      </w:r>
+      <w:r>
+        <w:t>”</w:t>
+      </w:r>
+    </w:p>
+    <w:p>
+      <w:pPr>
+        <w:pStyle w:val="NoSpacing"/>
+      </w:pPr>
+    </w:p>
+    <w:p>
+      <w:pPr>
+        <w:pStyle w:val="NoSpacing"/>
+      </w:pPr>
+      <w:r>
+        <w:t xml:space="preserve">To print the whole HashMap (prints out the value pairs randomly </w:t>
+      </w:r>
+      <w:r>
+        <w:sym w:font="Wingdings" w:char="F0E0"/>
+      </w:r>
+      <w:r>
+        <w:t xml:space="preserve"> not sorted), you can write: “</w:t>
+      </w:r>
+      <w:proofErr w:type="spellStart"/>
+      <w:r>
+        <w:rPr>
+          <w:b/>
+          <w:bCs/>
+        </w:rPr>
+        <w:t>System.out.println</w:t>
+      </w:r>
+      <w:proofErr w:type="spellEnd"/>
+      <w:r>
+        <w:rPr>
+          <w:b/>
+          <w:bCs/>
+        </w:rPr>
+        <w:t>(</w:t>
+      </w:r>
+      <w:proofErr w:type="spellStart"/>
+      <w:r>
+        <w:rPr>
+          <w:b/>
+          <w:bCs/>
+        </w:rPr>
+        <w:t>hashMapName.toString</w:t>
+      </w:r>
+      <w:proofErr w:type="spellEnd"/>
+      <w:r>
+        <w:rPr>
+          <w:b/>
+          <w:bCs/>
+        </w:rPr>
+        <w:t>());</w:t>
+      </w:r>
+      <w:r>
+        <w:t>”</w:t>
+      </w:r>
+    </w:p>
+    <w:p>
+      <w:pPr>
+        <w:pStyle w:val="NoSpacing"/>
+      </w:pPr>
+    </w:p>
+    <w:p>
+      <w:pPr>
+        <w:pStyle w:val="NoSpacing"/>
+      </w:pPr>
+      <w:r>
+        <w:t xml:space="preserve">To get / return a single item </w:t>
+      </w:r>
+      <w:r>
+        <w:t xml:space="preserve">associated with a specified key </w:t>
+      </w:r>
+      <w:r>
+        <w:t>from the HashMap, you can use “</w:t>
+      </w:r>
+      <w:proofErr w:type="spellStart"/>
+      <w:r>
+        <w:rPr>
+          <w:b/>
+          <w:bCs/>
+        </w:rPr>
+        <w:t>hashMapName.get</w:t>
+      </w:r>
+      <w:proofErr w:type="spellEnd"/>
+      <w:r>
+        <w:rPr>
+          <w:b/>
+          <w:bCs/>
+        </w:rPr>
+        <w:t>(</w:t>
+      </w:r>
+      <w:r>
+        <w:rPr>
+          <w:b/>
+          <w:bCs/>
+        </w:rPr>
+        <w:t>specified</w:t>
+      </w:r>
+      <w:r>
+        <w:rPr>
+          <w:b/>
+          <w:bCs/>
+        </w:rPr>
+        <w:t xml:space="preserve"> key)</w:t>
+      </w:r>
+      <w:r>
+        <w:t>”</w:t>
+      </w:r>
+      <w:r>
+        <w:t xml:space="preserve"> </w:t>
+      </w:r>
+      <w:r>
+        <w:sym w:font="Wingdings" w:char="F0E0"/>
+      </w:r>
+      <w:r>
+        <w:t xml:space="preserve"> it returns null if the key does not exist inside the </w:t>
+      </w:r>
+      <w:proofErr w:type="spellStart"/>
+      <w:r>
+        <w:t>hashMap</w:t>
+      </w:r>
+      <w:proofErr w:type="spellEnd"/>
+      <w:r>
+        <w:t>.</w:t>
+      </w:r>
+    </w:p>
+    <w:p>
+      <w:pPr>
+        <w:pStyle w:val="NoSpacing"/>
+      </w:pPr>
+      <w:r>
+        <w:t>To specify a default return value if the key is not found, you can use “</w:t>
+      </w:r>
+      <w:proofErr w:type="spellStart"/>
+      <w:r>
+        <w:rPr>
+          <w:b/>
+          <w:bCs/>
+        </w:rPr>
+        <w:t>hashMapName.get</w:t>
+      </w:r>
+      <w:r>
+        <w:rPr>
+          <w:b/>
+          <w:bCs/>
+        </w:rPr>
+        <w:t>OrDefault</w:t>
+      </w:r>
+      <w:proofErr w:type="spellEnd"/>
+      <w:r>
+        <w:rPr>
+          <w:b/>
+          <w:bCs/>
+        </w:rPr>
+        <w:t>(specified key</w:t>
+      </w:r>
+      <w:r>
+        <w:rPr>
+          <w:b/>
+          <w:bCs/>
+        </w:rPr>
+        <w:t>, return value</w:t>
+      </w:r>
+      <w:r>
+        <w:t>)” e.g.:</w:t>
+      </w:r>
+    </w:p>
+    <w:p>
+      <w:pPr>
+        <w:pStyle w:val="NoSpacing"/>
+      </w:pPr>
+      <w:proofErr w:type="spellStart"/>
+      <w:r>
+        <w:rPr>
+          <w:b/>
+          <w:bCs/>
+        </w:rPr>
+        <w:t>System.</w:t>
+      </w:r>
+      <w:r>
+        <w:rPr>
+          <w:b/>
+          <w:bCs/>
+          <w:i/>
+          <w:iCs/>
+        </w:rPr>
+        <w:t>out</w:t>
+      </w:r>
+      <w:r>
+        <w:rPr>
+          <w:b/>
+          <w:bCs/>
+        </w:rPr>
+        <w:t>.println</w:t>
+      </w:r>
+      <w:proofErr w:type="spellEnd"/>
+      <w:r>
+        <w:rPr>
+          <w:b/>
+          <w:bCs/>
+        </w:rPr>
+        <w:t>(</w:t>
+      </w:r>
+      <w:proofErr w:type="spellStart"/>
+      <w:r>
+        <w:rPr>
+          <w:b/>
+          <w:bCs/>
+        </w:rPr>
+        <w:t>examScores.getOrDefault</w:t>
+      </w:r>
+      <w:proofErr w:type="spellEnd"/>
+      <w:r>
+        <w:rPr>
+          <w:b/>
+          <w:bCs/>
+        </w:rPr>
+        <w:t>("English",-1));</w:t>
+      </w:r>
+      <w:r>
+        <w:t xml:space="preserve"> </w:t>
+      </w:r>
+      <w:r>
+        <w:sym w:font="Wingdings" w:char="F0E0"/>
+      </w:r>
+      <w:r>
+        <w:t xml:space="preserve"> </w:t>
+      </w:r>
+      <w:r>
+        <w:t>returns specified value (-1) if key not found</w:t>
+      </w:r>
+    </w:p>
+    <w:p>
+      <w:pPr>
+        <w:pStyle w:val="NoSpacing"/>
+      </w:pPr>
+    </w:p>
+    <w:p>
+      <w:pPr>
+        <w:pStyle w:val="NoSpacing"/>
+      </w:pPr>
+      <w:r>
+        <w:t xml:space="preserve">To check if a </w:t>
+      </w:r>
+      <w:proofErr w:type="spellStart"/>
+      <w:r>
+        <w:t>hashMap</w:t>
+      </w:r>
+      <w:proofErr w:type="spellEnd"/>
+      <w:r>
+        <w:t xml:space="preserve"> </w:t>
+      </w:r>
+      <w:r>
+        <w:rPr>
+          <w:b/>
+          <w:bCs/>
+        </w:rPr>
+        <w:t>contains a specified key</w:t>
+      </w:r>
+      <w:r>
+        <w:t>, you use “</w:t>
+      </w:r>
+      <w:proofErr w:type="spellStart"/>
+      <w:r>
+        <w:rPr>
+          <w:b/>
+          <w:bCs/>
+        </w:rPr>
+        <w:t>HashMapName.containsKey</w:t>
+      </w:r>
+      <w:proofErr w:type="spellEnd"/>
+      <w:r>
+        <w:rPr>
+          <w:b/>
+          <w:bCs/>
+        </w:rPr>
+        <w:t>(Key)</w:t>
+      </w:r>
+      <w:r>
+        <w:t xml:space="preserve">” </w:t>
+      </w:r>
+      <w:r>
+        <w:sym w:font="Wingdings" w:char="F0E0"/>
+      </w:r>
+      <w:r>
+        <w:t xml:space="preserve"> returns true or false</w:t>
+      </w:r>
+    </w:p>
+    <w:p>
+      <w:pPr>
+        <w:pStyle w:val="NoSpacing"/>
+      </w:pPr>
+      <w:r>
+        <w:t xml:space="preserve">To check if a </w:t>
+      </w:r>
+      <w:proofErr w:type="spellStart"/>
+      <w:r>
+        <w:t>hashMap</w:t>
+      </w:r>
+      <w:proofErr w:type="spellEnd"/>
+      <w:r>
+        <w:t xml:space="preserve"> contains a specified value, you use </w:t>
+      </w:r>
+      <w:r>
+        <w:t>“</w:t>
+      </w:r>
+      <w:proofErr w:type="spellStart"/>
+      <w:r>
+        <w:rPr>
+          <w:b/>
+          <w:bCs/>
+        </w:rPr>
+        <w:t>HashMapName.contains</w:t>
+      </w:r>
+      <w:r>
+        <w:rPr>
+          <w:b/>
+          <w:bCs/>
+        </w:rPr>
+        <w:t>Value</w:t>
+      </w:r>
+      <w:proofErr w:type="spellEnd"/>
+      <w:r>
+        <w:rPr>
+          <w:b/>
+          <w:bCs/>
+        </w:rPr>
+        <w:t>(</w:t>
+      </w:r>
+      <w:r>
+        <w:rPr>
+          <w:b/>
+          <w:bCs/>
+        </w:rPr>
+        <w:t>Value</w:t>
+      </w:r>
+      <w:r>
+        <w:rPr>
+          <w:b/>
+          <w:bCs/>
+        </w:rPr>
+        <w:t>)</w:t>
+      </w:r>
+      <w:r>
+        <w:t xml:space="preserve">” </w:t>
+      </w:r>
+      <w:r>
+        <w:sym w:font="Wingdings" w:char="F0E0"/>
+      </w:r>
+      <w:r>
+        <w:t xml:space="preserve"> returns true or false</w:t>
+      </w:r>
+    </w:p>
+    <w:p>
+      <w:pPr>
+        <w:pStyle w:val="NoSpacing"/>
+      </w:pPr>
+    </w:p>
+    <w:p>
+      <w:pPr>
+        <w:pStyle w:val="NoSpacing"/>
+      </w:pPr>
+      <w:r>
+        <w:t>To check if a HashMap is empty, you can use “</w:t>
+      </w:r>
+      <w:proofErr w:type="spellStart"/>
+      <w:r>
+        <w:rPr>
+          <w:b/>
+          <w:bCs/>
+        </w:rPr>
+        <w:t>hashMapName.isEmpty</w:t>
+      </w:r>
+      <w:proofErr w:type="spellEnd"/>
+      <w:r>
+        <w:rPr>
+          <w:b/>
+          <w:bCs/>
+        </w:rPr>
+        <w:t>()</w:t>
+      </w:r>
+      <w:r>
+        <w:t xml:space="preserve">” </w:t>
+      </w:r>
+      <w:r>
+        <w:sym w:font="Wingdings" w:char="F0E0"/>
+      </w:r>
+      <w:r>
+        <w:t xml:space="preserve"> returns true or false.</w:t>
+      </w:r>
+    </w:p>
+    <w:p>
+      <w:pPr>
+        <w:pStyle w:val="NoSpacing"/>
+      </w:pPr>
+    </w:p>
+    <w:p>
+      <w:pPr>
+        <w:pStyle w:val="NoSpacing"/>
+      </w:pPr>
+      <w:r>
+        <w:t>To return the number of value pairs in a HashMap, you use “</w:t>
+      </w:r>
+      <w:proofErr w:type="spellStart"/>
+      <w:r>
+        <w:rPr>
+          <w:b/>
+          <w:bCs/>
+        </w:rPr>
+        <w:t>HashMapName.size</w:t>
+      </w:r>
+      <w:proofErr w:type="spellEnd"/>
+      <w:r>
+        <w:rPr>
+          <w:b/>
+          <w:bCs/>
+        </w:rPr>
+        <w:t>()</w:t>
+      </w:r>
+      <w:r>
+        <w:t xml:space="preserve">” </w:t>
+      </w:r>
+      <w:r>
+        <w:sym w:font="Wingdings" w:char="F0E0"/>
+      </w:r>
+      <w:r>
+        <w:t xml:space="preserve"> returns an integer number.</w:t>
+      </w:r>
+    </w:p>
+    <w:p>
+      <w:pPr>
+        <w:pStyle w:val="NoSpacing"/>
+      </w:pPr>
+    </w:p>
+    <w:p>
+      <w:pPr>
+        <w:pStyle w:val="NoSpacing"/>
+      </w:pPr>
+      <w:r>
+        <w:t>To remove a value pair from a HashMap, you use “</w:t>
+      </w:r>
+      <w:proofErr w:type="spellStart"/>
+      <w:r>
+        <w:rPr>
+          <w:b/>
+          <w:bCs/>
+        </w:rPr>
+        <w:t>HashMapName.remove</w:t>
+      </w:r>
+      <w:proofErr w:type="spellEnd"/>
+      <w:r>
+        <w:rPr>
+          <w:b/>
+          <w:bCs/>
+        </w:rPr>
+        <w:t>(key)”</w:t>
+      </w:r>
+    </w:p>
+    <w:p>
+      <w:pPr>
+        <w:pStyle w:val="NoSpacing"/>
+      </w:pPr>
+    </w:p>
+    <w:p>
+      <w:pPr>
+        <w:pStyle w:val="NoSpacing"/>
+      </w:pPr>
+      <w:r>
+        <w:t xml:space="preserve">To </w:t>
+      </w:r>
+      <w:r>
+        <w:rPr>
+          <w:b/>
+          <w:bCs/>
+        </w:rPr>
+        <w:t>loop through a HashMap</w:t>
+      </w:r>
+      <w:r>
+        <w:t>, you can use “</w:t>
+      </w:r>
+      <w:proofErr w:type="spellStart"/>
+      <w:r>
+        <w:rPr>
+          <w:b/>
+          <w:bCs/>
+        </w:rPr>
+        <w:t>HashMapName.forEach</w:t>
+      </w:r>
+      <w:proofErr w:type="spellEnd"/>
+      <w:r>
+        <w:rPr>
+          <w:b/>
+          <w:bCs/>
+        </w:rPr>
+        <w:t>()</w:t>
+      </w:r>
+      <w:r>
+        <w:t xml:space="preserve">” e.g.: </w:t>
+      </w:r>
+    </w:p>
+    <w:p>
+      <w:pPr>
+        <w:pStyle w:val="NoSpacing"/>
+        <w:rPr>
+          <w:b/>
+          <w:bCs/>
+        </w:rPr>
+      </w:pPr>
+      <w:proofErr w:type="spellStart"/>
+      <w:r>
+        <w:rPr>
+          <w:b/>
+          <w:bCs/>
+        </w:rPr>
+        <w:t>examScores.forEach</w:t>
+      </w:r>
+      <w:proofErr w:type="spellEnd"/>
+      <w:r>
+        <w:rPr>
+          <w:b/>
+          <w:bCs/>
+        </w:rPr>
+        <w:t>((subject, score) -&gt; {</w:t>
+      </w:r>
+      <w:r>
+        <w:rPr>
+          <w:b/>
+          <w:bCs/>
+        </w:rPr>
+        <w:br/>
+        <w:t xml:space="preserve">    </w:t>
+      </w:r>
+      <w:proofErr w:type="spellStart"/>
+      <w:r>
+        <w:rPr>
+          <w:b/>
+          <w:bCs/>
+        </w:rPr>
+        <w:t>System.</w:t>
+      </w:r>
+      <w:r>
+        <w:rPr>
+          <w:b/>
+          <w:bCs/>
+          <w:i/>
+          <w:iCs/>
+        </w:rPr>
+        <w:t>out</w:t>
+      </w:r>
+      <w:r>
+        <w:rPr>
+          <w:b/>
+          <w:bCs/>
+        </w:rPr>
+        <w:t>.println</w:t>
+      </w:r>
+      <w:proofErr w:type="spellEnd"/>
+      <w:r>
+        <w:rPr>
+          <w:b/>
+          <w:bCs/>
+        </w:rPr>
+        <w:t>(subject + " - " + score);</w:t>
+      </w:r>
+      <w:r>
+        <w:rPr>
+          <w:b/>
+          <w:bCs/>
+        </w:rPr>
+        <w:br/>
+        <w:t>});</w:t>
+      </w:r>
+    </w:p>
+    <w:p>
+      <w:pPr>
+        <w:pStyle w:val="NoSpacing"/>
+        <w:rPr>
+          <w:u w:val="single"/>
+        </w:rPr>
+      </w:pPr>
+    </w:p>
+    <w:p>
+      <w:pPr>
+        <w:pStyle w:val="NoSpacing"/>
+        <w:rPr>
+          <w:b/>
+          <w:bCs/>
+          <w:u w:val="single"/>
+        </w:rPr>
+      </w:pPr>
+      <w:r>
+        <w:rPr>
+          <w:b/>
+          <w:bCs/>
+          <w:u w:val="single"/>
+        </w:rPr>
+        <w:t>Object Oriented Programming</w:t>
+      </w:r>
+    </w:p>
+    <w:p>
+      <w:pPr>
+        <w:pStyle w:val="NoSpacing"/>
+      </w:pPr>
+      <w:r>
+        <w:t>To instantiate an object, you must write the name of the class, followed by the name of the object, followed by “= new ” then the name of the class followed by brackets e.g.</w:t>
+      </w:r>
+    </w:p>
+    <w:p>
+      <w:pPr>
+        <w:pStyle w:val="NoSpacing"/>
+        <w:rPr>
+          <w:b/>
+          <w:bCs/>
+        </w:rPr>
+      </w:pPr>
+      <w:r>
+        <w:rPr>
+          <w:b/>
+          <w:bCs/>
+        </w:rPr>
+        <w:t xml:space="preserve">User </w:t>
+      </w:r>
+      <w:proofErr w:type="spellStart"/>
+      <w:r>
+        <w:rPr>
+          <w:b/>
+          <w:bCs/>
+        </w:rPr>
+        <w:t>youngerUser</w:t>
+      </w:r>
+      <w:proofErr w:type="spellEnd"/>
+      <w:r>
+        <w:rPr>
+          <w:b/>
+          <w:bCs/>
+        </w:rPr>
+        <w:t xml:space="preserve"> = new User();</w:t>
+      </w:r>
+    </w:p>
+    <w:p>
+      <w:pPr>
+        <w:pStyle w:val="NoSpacing"/>
+      </w:pPr>
+    </w:p>
+    <w:p>
+      <w:pPr>
+        <w:pStyle w:val="NoSpacing"/>
+      </w:pPr>
+      <w:r>
+        <w:t>If the class’s attributes are public, you can modify them by writing “</w:t>
+      </w:r>
+      <w:proofErr w:type="spellStart"/>
+      <w:r>
+        <w:t>objectName.attributeName</w:t>
+      </w:r>
+      <w:proofErr w:type="spellEnd"/>
+      <w:r>
+        <w:t xml:space="preserve"> = value”, e.g. </w:t>
+      </w:r>
+    </w:p>
+    <w:p>
+      <w:pPr>
+        <w:pStyle w:val="NoSpacing"/>
+        <w:rPr>
+          <w:b/>
+          <w:bCs/>
+        </w:rPr>
+      </w:pPr>
+      <w:r>
+        <w:rPr>
+          <w:b/>
+          <w:bCs/>
+        </w:rPr>
+        <w:t>youngerUser.name = "Walter";</w:t>
+      </w:r>
+      <w:r>
+        <w:rPr>
+          <w:b/>
+          <w:bCs/>
+        </w:rPr>
+        <w:br/>
+      </w:r>
+      <w:proofErr w:type="spellStart"/>
+      <w:r>
+        <w:rPr>
+          <w:b/>
+          <w:bCs/>
+        </w:rPr>
+        <w:t>youngerUser.birthday</w:t>
+      </w:r>
+      <w:proofErr w:type="spellEnd"/>
+      <w:r>
+        <w:rPr>
+          <w:b/>
+          <w:bCs/>
+        </w:rPr>
+        <w:t xml:space="preserve"> = </w:t>
+      </w:r>
+      <w:proofErr w:type="spellStart"/>
+      <w:r>
+        <w:rPr>
+          <w:b/>
+          <w:bCs/>
+        </w:rPr>
+        <w:t>LocalDate.</w:t>
+      </w:r>
+      <w:r>
+        <w:rPr>
+          <w:b/>
+          <w:bCs/>
+          <w:i/>
+          <w:iCs/>
+        </w:rPr>
+        <w:t>parse</w:t>
+      </w:r>
+      <w:proofErr w:type="spellEnd"/>
+      <w:r>
+        <w:rPr>
+          <w:b/>
+          <w:bCs/>
+        </w:rPr>
+        <w:t>("2009-04-09");</w:t>
+      </w:r>
+    </w:p>
+    <w:p>
+      <w:pPr>
+        <w:pStyle w:val="NoSpacing"/>
+      </w:pPr>
+    </w:p>
+    <w:p>
+      <w:pPr>
+        <w:pStyle w:val="NoSpacing"/>
+      </w:pPr>
+      <w:r>
+        <w:t>To declare a method, you write the access modifier, followed by the return data type, followed by the name of the method and brackets with any parameters. E.g.</w:t>
+      </w:r>
+    </w:p>
+    <w:p>
+      <w:pPr>
+        <w:pStyle w:val="NoSpacing"/>
+      </w:pPr>
+      <w:r>
+        <w:rPr>
+          <w:b/>
+          <w:bCs/>
+        </w:rPr>
+        <w:t>public int age(){</w:t>
+      </w:r>
+      <w:r>
+        <w:rPr>
+          <w:b/>
+          <w:bCs/>
+        </w:rPr>
+        <w:br/>
+        <w:t xml:space="preserve">    int age = </w:t>
+      </w:r>
+      <w:proofErr w:type="spellStart"/>
+      <w:r>
+        <w:rPr>
+          <w:b/>
+          <w:bCs/>
+        </w:rPr>
+        <w:t>Period.</w:t>
+      </w:r>
+      <w:r>
+        <w:rPr>
+          <w:b/>
+          <w:bCs/>
+          <w:i/>
+          <w:iCs/>
+        </w:rPr>
+        <w:t>between</w:t>
+      </w:r>
+      <w:proofErr w:type="spellEnd"/>
+      <w:r>
+        <w:rPr>
+          <w:b/>
+          <w:bCs/>
+        </w:rPr>
+        <w:t>(</w:t>
+      </w:r>
+      <w:proofErr w:type="spellStart"/>
+      <w:r>
+        <w:rPr>
+          <w:b/>
+          <w:bCs/>
+        </w:rPr>
+        <w:t>this.birthday</w:t>
+      </w:r>
+      <w:proofErr w:type="spellEnd"/>
+      <w:r>
+        <w:rPr>
+          <w:b/>
+          <w:bCs/>
+        </w:rPr>
+        <w:t xml:space="preserve">, </w:t>
+      </w:r>
+      <w:proofErr w:type="spellStart"/>
+      <w:r>
+        <w:rPr>
+          <w:b/>
+          <w:bCs/>
+        </w:rPr>
+        <w:t>LocalDate.</w:t>
+      </w:r>
+      <w:r>
+        <w:rPr>
+          <w:b/>
+          <w:bCs/>
+          <w:i/>
+          <w:iCs/>
+        </w:rPr>
+        <w:t>now</w:t>
+      </w:r>
+      <w:proofErr w:type="spellEnd"/>
+      <w:r>
+        <w:rPr>
+          <w:b/>
+          <w:bCs/>
+        </w:rPr>
+        <w:t>()).</w:t>
+      </w:r>
+      <w:proofErr w:type="spellStart"/>
+      <w:r>
+        <w:rPr>
+          <w:b/>
+          <w:bCs/>
+        </w:rPr>
+        <w:t>getYears</w:t>
+      </w:r>
+      <w:proofErr w:type="spellEnd"/>
+      <w:r>
+        <w:rPr>
+          <w:b/>
+          <w:bCs/>
+        </w:rPr>
+        <w:t>();</w:t>
+      </w:r>
+      <w:r>
+        <w:rPr>
+          <w:b/>
+          <w:bCs/>
+        </w:rPr>
+        <w:br/>
+        <w:t xml:space="preserve">    return age;</w:t>
+      </w:r>
+      <w:r>
+        <w:rPr>
+          <w:b/>
+          <w:bCs/>
+        </w:rPr>
+        <w:br/>
+        <w:t>}</w:t>
+      </w:r>
+      <w:r>
+        <w:rPr>
+          <w:b/>
+          <w:bCs/>
+        </w:rPr>
+        <w:t xml:space="preserve"> </w:t>
+      </w:r>
+      <w:r>
+        <w:rPr>
+          <w:b/>
+          <w:bCs/>
+        </w:rPr>
+        <w:sym w:font="Wingdings" w:char="F0E0"/>
+      </w:r>
+      <w:r>
+        <w:rPr>
+          <w:b/>
+          <w:bCs/>
+        </w:rPr>
+        <w:t xml:space="preserve"> </w:t>
+      </w:r>
+      <w:r>
+        <w:t>the “</w:t>
+      </w:r>
+      <w:r>
+        <w:rPr>
+          <w:b/>
+          <w:bCs/>
+        </w:rPr>
+        <w:t>this</w:t>
+      </w:r>
+      <w:r>
+        <w:t>” Returns the current object performing the call of the method</w:t>
+      </w:r>
+    </w:p>
+    <w:p>
+      <w:pPr>
+        <w:pStyle w:val="NoSpacing"/>
+      </w:pPr>
+    </w:p>
+    <w:p>
+      <w:pPr>
+        <w:pStyle w:val="NoSpacing"/>
+      </w:pPr>
+      <w:r>
+        <w:t>To call the method you write “</w:t>
+      </w:r>
+      <w:proofErr w:type="spellStart"/>
+      <w:r>
+        <w:t>objectName.methodName</w:t>
+      </w:r>
+      <w:proofErr w:type="spellEnd"/>
+      <w:r>
+        <w:t>” e.g. :</w:t>
+      </w:r>
+    </w:p>
+    <w:p>
+      <w:pPr>
+        <w:pStyle w:val="NoSpacing"/>
+        <w:rPr>
+          <w:b/>
+          <w:bCs/>
+        </w:rPr>
+      </w:pPr>
+      <w:r>
+        <w:rPr>
+          <w:b/>
+          <w:bCs/>
+        </w:rPr>
+        <w:t xml:space="preserve">Int age = </w:t>
+      </w:r>
+      <w:proofErr w:type="spellStart"/>
+      <w:r>
+        <w:rPr>
+          <w:b/>
+          <w:bCs/>
+        </w:rPr>
+        <w:t>youngerUser.age</w:t>
+      </w:r>
+      <w:proofErr w:type="spellEnd"/>
+      <w:r>
+        <w:rPr>
+          <w:b/>
+          <w:bCs/>
+        </w:rPr>
+        <w:t>();</w:t>
+      </w:r>
+    </w:p>
+    <w:p>
+      <w:pPr>
+        <w:pStyle w:val="NoSpacing"/>
+      </w:pPr>
+    </w:p>
+    <w:p>
+      <w:pPr>
+        <w:pStyle w:val="NoSpacing"/>
+      </w:pPr>
+      <w:r>
+        <w:t>A method can have a parameter of another class e.g.:</w:t>
+      </w:r>
+    </w:p>
+    <w:p>
+      <w:pPr>
+        <w:pStyle w:val="NoSpacing"/>
+        <w:rPr>
+          <w:b/>
+          <w:bCs/>
+        </w:rPr>
+      </w:pPr>
+      <w:r>
+        <w:rPr>
+          <w:b/>
+          <w:bCs/>
+        </w:rPr>
+        <w:t xml:space="preserve">public void </w:t>
+      </w:r>
+      <w:proofErr w:type="gramStart"/>
+      <w:r>
+        <w:rPr>
+          <w:b/>
+          <w:bCs/>
+        </w:rPr>
+        <w:t>borrow</w:t>
+      </w:r>
+      <w:proofErr w:type="gramEnd"/>
+      <w:r>
+        <w:rPr>
+          <w:b/>
+          <w:bCs/>
+        </w:rPr>
+        <w:t>(Book book){</w:t>
+      </w:r>
+      <w:r>
+        <w:rPr>
+          <w:b/>
+          <w:bCs/>
+        </w:rPr>
+        <w:t xml:space="preserve"> </w:t>
+      </w:r>
+      <w:r>
+        <w:sym w:font="Wingdings" w:char="F0E0"/>
+      </w:r>
+      <w:r>
+        <w:t xml:space="preserve"> Book is the class that is taken as an argument</w:t>
+      </w:r>
+      <w:r>
+        <w:rPr>
+          <w:b/>
+          <w:bCs/>
+        </w:rPr>
+        <w:br/>
+        <w:t>}</w:t>
+      </w:r>
+    </w:p>
+    <w:p>
+      <w:pPr>
+        <w:pStyle w:val="NoSpacing"/>
+      </w:pPr>
+      <w:r>
+        <w:t>An Array list can also be made up of objects of a particular class, e.g.:</w:t>
+      </w:r>
+    </w:p>
+    <w:p>
+      <w:pPr>
+        <w:pStyle w:val="NoSpacing"/>
+        <w:rPr>
+          <w:b/>
+          <w:bCs/>
+        </w:rPr>
+      </w:pPr>
+      <w:proofErr w:type="spellStart"/>
+      <w:r>
+        <w:rPr>
+          <w:b/>
+          <w:bCs/>
+        </w:rPr>
+        <w:t>ArrayList</w:t>
+      </w:r>
+      <w:proofErr w:type="spellEnd"/>
+      <w:r>
+        <w:rPr>
+          <w:b/>
+          <w:bCs/>
+        </w:rPr>
+        <w:t xml:space="preserve">&lt;Book&gt; books = new </w:t>
+      </w:r>
+      <w:proofErr w:type="spellStart"/>
+      <w:r>
+        <w:rPr>
+          <w:b/>
+          <w:bCs/>
+        </w:rPr>
+        <w:t>ArrayList</w:t>
+      </w:r>
+      <w:proofErr w:type="spellEnd"/>
+      <w:r>
+        <w:rPr>
+          <w:b/>
+          <w:bCs/>
+        </w:rPr>
+        <w:t>&lt;Book&gt;();</w:t>
+      </w:r>
+    </w:p>
+    <w:p>
+      <w:pPr>
+        <w:pStyle w:val="NoSpacing"/>
+      </w:pPr>
+    </w:p>
+    <w:p>
+      <w:pPr>
+        <w:pStyle w:val="NoSpacing"/>
+      </w:pPr>
+      <w:r>
+        <w:t>You can override a method by declaring a method with the same name in the class.</w:t>
+      </w:r>
+    </w:p>
+    <w:p>
+      <w:pPr>
+        <w:pStyle w:val="NoSpacing"/>
+      </w:pPr>
+    </w:p>
+    <w:p>
+      <w:pPr>
+        <w:pStyle w:val="NoSpacing"/>
+        <w:rPr>
+          <w:b/>
+          <w:bCs/>
+          <w:u w:val="single"/>
+        </w:rPr>
+      </w:pPr>
+      <w:r>
+        <w:rPr>
+          <w:b/>
+          <w:bCs/>
+          <w:u w:val="single"/>
+        </w:rPr>
+        <w:t>Constructors</w:t>
+      </w:r>
+    </w:p>
+    <w:p>
+      <w:pPr>
+        <w:pStyle w:val="NoSpacing"/>
+      </w:pPr>
+      <w:r>
+        <w:t>To write a constructor method, you first write the name of the class followed by brackets that contain each parameter and their data type e.g.:</w:t>
+      </w:r>
+    </w:p>
+    <w:p>
+      <w:pPr>
+        <w:pStyle w:val="NoSpacing"/>
+        <w:rPr>
+          <w:b/>
+          <w:bCs/>
+        </w:rPr>
+      </w:pPr>
+      <w:r>
+        <w:rPr>
+          <w:b/>
+          <w:bCs/>
+        </w:rPr>
+        <w:t>User(String Name, String Birthday){</w:t>
+      </w:r>
+      <w:r>
+        <w:rPr>
+          <w:b/>
+          <w:bCs/>
+        </w:rPr>
+        <w:br/>
+        <w:t xml:space="preserve">    this.name = Name;</w:t>
+      </w:r>
+      <w:r>
+        <w:rPr>
+          <w:b/>
+          <w:bCs/>
+        </w:rPr>
+        <w:br/>
+        <w:t xml:space="preserve">    </w:t>
+      </w:r>
+      <w:proofErr w:type="spellStart"/>
+      <w:r>
+        <w:rPr>
+          <w:b/>
+          <w:bCs/>
+        </w:rPr>
+        <w:t>this.birthday</w:t>
+      </w:r>
+      <w:proofErr w:type="spellEnd"/>
+      <w:r>
+        <w:rPr>
+          <w:b/>
+          <w:bCs/>
+        </w:rPr>
+        <w:t xml:space="preserve"> = </w:t>
+      </w:r>
+      <w:proofErr w:type="spellStart"/>
+      <w:r>
+        <w:rPr>
+          <w:b/>
+          <w:bCs/>
+        </w:rPr>
+        <w:t>LocalDate.</w:t>
+      </w:r>
+      <w:r>
+        <w:rPr>
+          <w:b/>
+          <w:bCs/>
+          <w:i/>
+          <w:iCs/>
+        </w:rPr>
+        <w:t>parse</w:t>
+      </w:r>
+      <w:proofErr w:type="spellEnd"/>
+      <w:r>
+        <w:rPr>
+          <w:b/>
+          <w:bCs/>
+        </w:rPr>
+        <w:t>(Birthday);</w:t>
+      </w:r>
+      <w:r>
+        <w:rPr>
+          <w:b/>
+          <w:bCs/>
+        </w:rPr>
+        <w:br/>
+        <w:t>}</w:t>
+      </w:r>
+    </w:p>
+    <w:p>
+      <w:pPr>
+        <w:pStyle w:val="NoSpacing"/>
+      </w:pPr>
+    </w:p>
+    <w:p>
+      <w:pPr>
+        <w:pStyle w:val="NoSpacing"/>
+      </w:pPr>
+      <w:r>
+        <w:lastRenderedPageBreak/>
+        <w:t>Getters are methods that return a value of an attribute (usually named “get” followed by the attribute name) e.g.</w:t>
+      </w:r>
+    </w:p>
+    <w:p>
+      <w:pPr>
+        <w:pStyle w:val="NoSpacing"/>
+        <w:rPr>
+          <w:b/>
+          <w:bCs/>
+        </w:rPr>
+      </w:pPr>
+      <w:r>
+        <w:rPr>
+          <w:b/>
+          <w:bCs/>
+        </w:rPr>
+        <w:t xml:space="preserve">public String </w:t>
+      </w:r>
+      <w:proofErr w:type="spellStart"/>
+      <w:r>
+        <w:rPr>
+          <w:b/>
+          <w:bCs/>
+        </w:rPr>
+        <w:t>getName</w:t>
+      </w:r>
+      <w:proofErr w:type="spellEnd"/>
+      <w:r>
+        <w:rPr>
+          <w:b/>
+          <w:bCs/>
+        </w:rPr>
+        <w:t>(){</w:t>
+      </w:r>
+      <w:r>
+        <w:rPr>
+          <w:b/>
+          <w:bCs/>
+        </w:rPr>
+        <w:br/>
+        <w:t xml:space="preserve">    return this.name;</w:t>
+      </w:r>
+      <w:r>
+        <w:rPr>
+          <w:b/>
+          <w:bCs/>
+        </w:rPr>
+        <w:br/>
+        <w:t>}</w:t>
+      </w:r>
+    </w:p>
+    <w:p>
+      <w:pPr>
+        <w:pStyle w:val="NoSpacing"/>
+      </w:pPr>
+    </w:p>
+    <w:p>
+      <w:pPr>
+        <w:pStyle w:val="NoSpacing"/>
+        <w:rPr>
+          <w:b/>
+          <w:bCs/>
+          <w:u w:val="single"/>
+        </w:rPr>
+      </w:pPr>
+      <w:r>
+        <w:rPr>
+          <w:b/>
+          <w:bCs/>
+          <w:u w:val="single"/>
+        </w:rPr>
+        <w:t>Inheritance</w:t>
+      </w:r>
+    </w:p>
+    <w:p>
+      <w:pPr>
+        <w:pStyle w:val="NoSpacing"/>
+      </w:pPr>
+      <w:r>
+        <w:t xml:space="preserve">To make one class inherit from another, you write “extends” e.g. </w:t>
+      </w:r>
+    </w:p>
+    <w:p>
+      <w:pPr>
+        <w:pStyle w:val="NoSpacing"/>
+        <w:rPr>
+          <w:b/>
+          <w:bCs/>
+        </w:rPr>
+      </w:pPr>
+      <w:r>
+        <w:rPr>
+          <w:b/>
+          <w:bCs/>
+        </w:rPr>
+        <w:t xml:space="preserve">public class </w:t>
+      </w:r>
+      <w:proofErr w:type="spellStart"/>
+      <w:r>
+        <w:rPr>
+          <w:b/>
+          <w:bCs/>
+        </w:rPr>
+        <w:t>AudioBook</w:t>
+      </w:r>
+      <w:proofErr w:type="spellEnd"/>
+      <w:r>
+        <w:rPr>
+          <w:b/>
+          <w:bCs/>
+        </w:rPr>
+        <w:t xml:space="preserve"> extends Book {</w:t>
+      </w:r>
+      <w:r>
+        <w:rPr>
+          <w:b/>
+          <w:bCs/>
+        </w:rPr>
+        <w:br/>
+        <w:t>}</w:t>
+      </w:r>
+    </w:p>
+    <w:p>
+      <w:pPr>
+        <w:pStyle w:val="NoSpacing"/>
+      </w:pPr>
+    </w:p>
+    <w:p>
+      <w:pPr>
+        <w:pStyle w:val="NoSpacing"/>
+      </w:pPr>
+      <w:r>
+        <w:t>The constructor must include all the parent class’s attributes as parameters (unless some have default values), (and any of its own attributes), and can then use “</w:t>
+      </w:r>
+      <w:r>
+        <w:rPr>
+          <w:b/>
+          <w:bCs/>
+        </w:rPr>
+        <w:t>super</w:t>
+      </w:r>
+      <w:r>
+        <w:t xml:space="preserve">” to call the parent class’s constructor and pass in the correct parameters e.g.: </w:t>
+      </w:r>
+    </w:p>
+    <w:p>
+      <w:pPr>
+        <w:pStyle w:val="NoSpacing"/>
+        <w:rPr>
+          <w:b/>
+          <w:bCs/>
+        </w:rPr>
+      </w:pPr>
+      <w:proofErr w:type="spellStart"/>
+      <w:r>
+        <w:rPr>
+          <w:b/>
+          <w:bCs/>
+        </w:rPr>
+        <w:t>AudioBook</w:t>
+      </w:r>
+      <w:proofErr w:type="spellEnd"/>
+      <w:r>
+        <w:rPr>
+          <w:b/>
+          <w:bCs/>
+        </w:rPr>
+        <w:t xml:space="preserve">(String Title, String Author, int </w:t>
+      </w:r>
+      <w:proofErr w:type="spellStart"/>
+      <w:r>
+        <w:rPr>
+          <w:b/>
+          <w:bCs/>
+        </w:rPr>
+        <w:t>PageCount</w:t>
+      </w:r>
+      <w:proofErr w:type="spellEnd"/>
+      <w:r>
+        <w:rPr>
+          <w:b/>
+          <w:bCs/>
+        </w:rPr>
+        <w:t>, int runtime){</w:t>
+      </w:r>
+      <w:r>
+        <w:rPr>
+          <w:b/>
+          <w:bCs/>
+        </w:rPr>
+        <w:br/>
+        <w:t xml:space="preserve">    super(Title, Author, </w:t>
+      </w:r>
+      <w:proofErr w:type="spellStart"/>
+      <w:r>
+        <w:rPr>
+          <w:b/>
+          <w:bCs/>
+        </w:rPr>
+        <w:t>PageCount</w:t>
+      </w:r>
+      <w:proofErr w:type="spellEnd"/>
+      <w:r>
+        <w:rPr>
+          <w:b/>
+          <w:bCs/>
+        </w:rPr>
+        <w:t>);</w:t>
+      </w:r>
+      <w:r>
+        <w:rPr>
+          <w:b/>
+          <w:bCs/>
+        </w:rPr>
+        <w:br/>
+        <w:t xml:space="preserve">    </w:t>
+      </w:r>
+      <w:proofErr w:type="spellStart"/>
+      <w:r>
+        <w:rPr>
+          <w:b/>
+          <w:bCs/>
+        </w:rPr>
+        <w:t>this.Runtime</w:t>
+      </w:r>
+      <w:proofErr w:type="spellEnd"/>
+      <w:r>
+        <w:rPr>
+          <w:b/>
+          <w:bCs/>
+        </w:rPr>
+        <w:t xml:space="preserve"> = runtime;</w:t>
+      </w:r>
+      <w:r>
+        <w:rPr>
+          <w:b/>
+          <w:bCs/>
+        </w:rPr>
+        <w:br/>
+        <w:t>}</w:t>
+      </w:r>
+    </w:p>
+    <w:p>
+      <w:pPr>
+        <w:pStyle w:val="NoSpacing"/>
+      </w:pPr>
     </w:p>
     <w:sectPr>
       <w:pgSz w:w="11906" w:h="16838"/>
@@ -7498,6 +9388,241 @@
     </w:sectPr>
   </w:body>
 </w:document>
+</file>
+
+<file path=word/numbering.xml><?xml version="1.0" encoding="utf-8"?>
+<w:numbering xmlns:wpc="http://schemas.microsoft.com/office/word/2010/wordprocessingCanvas" xmlns:cx="http://schemas.microsoft.com/office/drawing/2014/chartex" xmlns:cx1="http://schemas.microsoft.com/office/drawing/2015/9/8/chartex" xmlns:cx2="http://schemas.microsoft.com/office/drawing/2015/10/21/chartex" xmlns:cx3="http://schemas.microsoft.com/office/drawing/2016/5/9/chartex" xmlns:cx4="http://schemas.microsoft.com/office/drawing/2016/5/10/chartex" xmlns:cx5="http://schemas.microsoft.com/office/drawing/2016/5/11/chartex" xmlns:cx6="http://schemas.microsoft.com/office/drawing/2016/5/12/chartex" xmlns:cx7="http://schemas.microsoft.com/office/drawing/2016/5/13/chartex" xmlns:cx8="http://schemas.microsoft.com/office/drawing/2016/5/14/chartex" xmlns:mc="http://schemas.openxmlformats.org/markup-compatibility/2006" xmlns:aink="http://schemas.microsoft.com/office/drawing/2016/ink" xmlns:am3d="http://schemas.microsoft.com/office/drawing/2017/model3d" xmlns:o="urn:schemas-microsoft-com:office:office" xmlns:oel="http://schemas.microsoft.com/office/2019/extlst" xmlns:r="http://schemas.openxmlformats.org/officeDocument/2006/relationships" xmlns:m="http://schemas.openxmlformats.org/officeDocument/2006/math" xmlns:v="urn:schemas-microsoft-com:vml" xmlns:wp14="http://schemas.microsoft.com/office/word/2010/wordprocessingDrawing" xmlns:wp="http://schemas.openxmlformats.org/drawingml/2006/wordprocessingDrawing" xmlns:w10="urn:schemas-microsoft-com:office:word" xmlns:w="http://schemas.openxmlformats.org/wordprocessingml/2006/main" xmlns:w14="http://schemas.microsoft.com/office/word/2010/wordml" xmlns:w15="http://schemas.microsoft.com/office/word/2012/wordml" xmlns:w16cex="http://schemas.microsoft.com/office/word/2018/wordml/cex" xmlns:w16cid="http://schemas.microsoft.com/office/word/2016/wordml/cid" xmlns:w16="http://schemas.microsoft.com/office/word/2018/wordml" xmlns:w16du="http://schemas.microsoft.com/office/word/2023/wordml/word16du" xmlns:w16sdtdh="http://schemas.microsoft.com/office/word/2020/wordml/sdtdatahash" xmlns:w16sdtfl="http://schemas.microsoft.com/office/word/2024/wordml/sdtformatlock" xmlns:w16se="http://schemas.microsoft.com/office/word/2015/wordml/symex" xmlns:wpg="http://schemas.microsoft.com/office/word/2010/wordprocessingGroup" xmlns:wpi="http://schemas.microsoft.com/office/word/2010/wordprocessingInk" xmlns:wne="http://schemas.microsoft.com/office/word/2006/wordml" xmlns:wps="http://schemas.microsoft.com/office/word/2010/wordprocessingShape" mc:Ignorable="w14 w15 w16se w16cid w16 w16cex w16sdtdh w16sdtfl w16du wp14">
+  <w:abstractNum w:abstractNumId="0" w15:restartNumberingAfterBreak="0">
+    <w:nsid w:val="265A7220"/>
+    <w:multiLevelType w:val="hybridMultilevel"/>
+    <w:tmpl w:val="16C4C0D0"/>
+    <w:lvl w:ilvl="0" w:tplc="8786B032">
+      <w:numFmt w:val="bullet"/>
+      <w:lvlText w:val=""/>
+      <w:lvlJc w:val="left"/>
+      <w:pPr>
+        <w:ind w:left="720" w:hanging="360"/>
+      </w:pPr>
+      <w:rPr>
+        <w:rFonts w:ascii="Wingdings" w:eastAsiaTheme="minorHAnsi" w:hAnsi="Wingdings" w:cstheme="minorBidi" w:hint="default"/>
+      </w:rPr>
+    </w:lvl>
+    <w:lvl w:ilvl="1" w:tplc="08090003" w:tentative="1">
+      <w:start w:val="1"/>
+      <w:numFmt w:val="bullet"/>
+      <w:lvlText w:val="o"/>
+      <w:lvlJc w:val="left"/>
+      <w:pPr>
+        <w:ind w:left="1440" w:hanging="360"/>
+      </w:pPr>
+      <w:rPr>
+        <w:rFonts w:ascii="Courier New" w:hAnsi="Courier New" w:cs="Courier New" w:hint="default"/>
+      </w:rPr>
+    </w:lvl>
+    <w:lvl w:ilvl="2" w:tplc="08090005" w:tentative="1">
+      <w:start w:val="1"/>
+      <w:numFmt w:val="bullet"/>
+      <w:lvlText w:val=""/>
+      <w:lvlJc w:val="left"/>
+      <w:pPr>
+        <w:ind w:left="2160" w:hanging="360"/>
+      </w:pPr>
+      <w:rPr>
+        <w:rFonts w:ascii="Wingdings" w:hAnsi="Wingdings" w:hint="default"/>
+      </w:rPr>
+    </w:lvl>
+    <w:lvl w:ilvl="3" w:tplc="08090001" w:tentative="1">
+      <w:start w:val="1"/>
+      <w:numFmt w:val="bullet"/>
+      <w:lvlText w:val=""/>
+      <w:lvlJc w:val="left"/>
+      <w:pPr>
+        <w:ind w:left="2880" w:hanging="360"/>
+      </w:pPr>
+      <w:rPr>
+        <w:rFonts w:ascii="Symbol" w:hAnsi="Symbol" w:hint="default"/>
+      </w:rPr>
+    </w:lvl>
+    <w:lvl w:ilvl="4" w:tplc="08090003" w:tentative="1">
+      <w:start w:val="1"/>
+      <w:numFmt w:val="bullet"/>
+      <w:lvlText w:val="o"/>
+      <w:lvlJc w:val="left"/>
+      <w:pPr>
+        <w:ind w:left="3600" w:hanging="360"/>
+      </w:pPr>
+      <w:rPr>
+        <w:rFonts w:ascii="Courier New" w:hAnsi="Courier New" w:cs="Courier New" w:hint="default"/>
+      </w:rPr>
+    </w:lvl>
+    <w:lvl w:ilvl="5" w:tplc="08090005" w:tentative="1">
+      <w:start w:val="1"/>
+      <w:numFmt w:val="bullet"/>
+      <w:lvlText w:val=""/>
+      <w:lvlJc w:val="left"/>
+      <w:pPr>
+        <w:ind w:left="4320" w:hanging="360"/>
+      </w:pPr>
+      <w:rPr>
+        <w:rFonts w:ascii="Wingdings" w:hAnsi="Wingdings" w:hint="default"/>
+      </w:rPr>
+    </w:lvl>
+    <w:lvl w:ilvl="6" w:tplc="08090001" w:tentative="1">
+      <w:start w:val="1"/>
+      <w:numFmt w:val="bullet"/>
+      <w:lvlText w:val=""/>
+      <w:lvlJc w:val="left"/>
+      <w:pPr>
+        <w:ind w:left="5040" w:hanging="360"/>
+      </w:pPr>
+      <w:rPr>
+        <w:rFonts w:ascii="Symbol" w:hAnsi="Symbol" w:hint="default"/>
+      </w:rPr>
+    </w:lvl>
+    <w:lvl w:ilvl="7" w:tplc="08090003" w:tentative="1">
+      <w:start w:val="1"/>
+      <w:numFmt w:val="bullet"/>
+      <w:lvlText w:val="o"/>
+      <w:lvlJc w:val="left"/>
+      <w:pPr>
+        <w:ind w:left="5760" w:hanging="360"/>
+      </w:pPr>
+      <w:rPr>
+        <w:rFonts w:ascii="Courier New" w:hAnsi="Courier New" w:cs="Courier New" w:hint="default"/>
+      </w:rPr>
+    </w:lvl>
+    <w:lvl w:ilvl="8" w:tplc="08090005" w:tentative="1">
+      <w:start w:val="1"/>
+      <w:numFmt w:val="bullet"/>
+      <w:lvlText w:val=""/>
+      <w:lvlJc w:val="left"/>
+      <w:pPr>
+        <w:ind w:left="6480" w:hanging="360"/>
+      </w:pPr>
+      <w:rPr>
+        <w:rFonts w:ascii="Wingdings" w:hAnsi="Wingdings" w:hint="default"/>
+      </w:rPr>
+    </w:lvl>
+  </w:abstractNum>
+  <w:abstractNum w:abstractNumId="1" w15:restartNumberingAfterBreak="0">
+    <w:nsid w:val="48E12B6E"/>
+    <w:multiLevelType w:val="hybridMultilevel"/>
+    <w:tmpl w:val="BC5C846A"/>
+    <w:lvl w:ilvl="0" w:tplc="72140BC4">
+      <w:numFmt w:val="bullet"/>
+      <w:lvlText w:val=""/>
+      <w:lvlJc w:val="left"/>
+      <w:pPr>
+        <w:ind w:left="720" w:hanging="360"/>
+      </w:pPr>
+      <w:rPr>
+        <w:rFonts w:ascii="Wingdings" w:eastAsiaTheme="minorHAnsi" w:hAnsi="Wingdings" w:cstheme="minorBidi" w:hint="default"/>
+      </w:rPr>
+    </w:lvl>
+    <w:lvl w:ilvl="1" w:tplc="08090003" w:tentative="1">
+      <w:start w:val="1"/>
+      <w:numFmt w:val="bullet"/>
+      <w:lvlText w:val="o"/>
+      <w:lvlJc w:val="left"/>
+      <w:pPr>
+        <w:ind w:left="1440" w:hanging="360"/>
+      </w:pPr>
+      <w:rPr>
+        <w:rFonts w:ascii="Courier New" w:hAnsi="Courier New" w:cs="Courier New" w:hint="default"/>
+      </w:rPr>
+    </w:lvl>
+    <w:lvl w:ilvl="2" w:tplc="08090005" w:tentative="1">
+      <w:start w:val="1"/>
+      <w:numFmt w:val="bullet"/>
+      <w:lvlText w:val=""/>
+      <w:lvlJc w:val="left"/>
+      <w:pPr>
+        <w:ind w:left="2160" w:hanging="360"/>
+      </w:pPr>
+      <w:rPr>
+        <w:rFonts w:ascii="Wingdings" w:hAnsi="Wingdings" w:hint="default"/>
+      </w:rPr>
+    </w:lvl>
+    <w:lvl w:ilvl="3" w:tplc="08090001" w:tentative="1">
+      <w:start w:val="1"/>
+      <w:numFmt w:val="bullet"/>
+      <w:lvlText w:val=""/>
+      <w:lvlJc w:val="left"/>
+      <w:pPr>
+        <w:ind w:left="2880" w:hanging="360"/>
+      </w:pPr>
+      <w:rPr>
+        <w:rFonts w:ascii="Symbol" w:hAnsi="Symbol" w:hint="default"/>
+      </w:rPr>
+    </w:lvl>
+    <w:lvl w:ilvl="4" w:tplc="08090003" w:tentative="1">
+      <w:start w:val="1"/>
+      <w:numFmt w:val="bullet"/>
+      <w:lvlText w:val="o"/>
+      <w:lvlJc w:val="left"/>
+      <w:pPr>
+        <w:ind w:left="3600" w:hanging="360"/>
+      </w:pPr>
+      <w:rPr>
+        <w:rFonts w:ascii="Courier New" w:hAnsi="Courier New" w:cs="Courier New" w:hint="default"/>
+      </w:rPr>
+    </w:lvl>
+    <w:lvl w:ilvl="5" w:tplc="08090005" w:tentative="1">
+      <w:start w:val="1"/>
+      <w:numFmt w:val="bullet"/>
+      <w:lvlText w:val=""/>
+      <w:lvlJc w:val="left"/>
+      <w:pPr>
+        <w:ind w:left="4320" w:hanging="360"/>
+      </w:pPr>
+      <w:rPr>
+        <w:rFonts w:ascii="Wingdings" w:hAnsi="Wingdings" w:hint="default"/>
+      </w:rPr>
+    </w:lvl>
+    <w:lvl w:ilvl="6" w:tplc="08090001" w:tentative="1">
+      <w:start w:val="1"/>
+      <w:numFmt w:val="bullet"/>
+      <w:lvlText w:val=""/>
+      <w:lvlJc w:val="left"/>
+      <w:pPr>
+        <w:ind w:left="5040" w:hanging="360"/>
+      </w:pPr>
+      <w:rPr>
+        <w:rFonts w:ascii="Symbol" w:hAnsi="Symbol" w:hint="default"/>
+      </w:rPr>
+    </w:lvl>
+    <w:lvl w:ilvl="7" w:tplc="08090003" w:tentative="1">
+      <w:start w:val="1"/>
+      <w:numFmt w:val="bullet"/>
+      <w:lvlText w:val="o"/>
+      <w:lvlJc w:val="left"/>
+      <w:pPr>
+        <w:ind w:left="5760" w:hanging="360"/>
+      </w:pPr>
+      <w:rPr>
+        <w:rFonts w:ascii="Courier New" w:hAnsi="Courier New" w:cs="Courier New" w:hint="default"/>
+      </w:rPr>
+    </w:lvl>
+    <w:lvl w:ilvl="8" w:tplc="08090005" w:tentative="1">
+      <w:start w:val="1"/>
+      <w:numFmt w:val="bullet"/>
+      <w:lvlText w:val=""/>
+      <w:lvlJc w:val="left"/>
+      <w:pPr>
+        <w:ind w:left="6480" w:hanging="360"/>
+      </w:pPr>
+      <w:rPr>
+        <w:rFonts w:ascii="Wingdings" w:hAnsi="Wingdings" w:hint="default"/>
+      </w:rPr>
+    </w:lvl>
+  </w:abstractNum>
+  <w:num w:numId="1" w16cid:durableId="1291521753">
+    <w:abstractNumId w:val="0"/>
+  </w:num>
+  <w:num w:numId="2" w16cid:durableId="1270284906">
+    <w:abstractNumId w:val="1"/>
+  </w:num>
+</w:numbering>
 </file>
 
 <file path=word/styles.xml><?xml version="1.0" encoding="utf-8"?>

</xml_diff>